<commit_message>
Layout changes made on research doc.
</commit_message>
<xml_diff>
--- a/Individual project/LO-05/Professional Standard/Research_Document_TrustPartner.docx
+++ b/Individual project/LO-05/Professional Standard/Research_Document_TrustPartner.docx
@@ -386,7 +386,7 @@
           <w:lang w:val="en-GB"/>
           <w14:ligatures w14:val="none"/>
         </w:rPr>
-        <w:t>2026-04-17</w:t>
+        <w:t>2026-04-28</w:t>
       </w:r>
       <w:r>
         <w:rPr>
@@ -463,37 +463,8 @@
       <w:r>
         <w:t xml:space="preserve">. </w:t>
       </w:r>
-      <w:proofErr w:type="gramStart"/>
-      <w:r>
-        <w:t>In order to</w:t>
-      </w:r>
-      <w:proofErr w:type="gramEnd"/>
-      <w:r>
-        <w:t xml:space="preserve"> meet all the project’s </w:t>
-      </w:r>
-      <w:proofErr w:type="gramStart"/>
-      <w:r>
-        <w:t>requirement</w:t>
-      </w:r>
-      <w:proofErr w:type="gramEnd"/>
-      <w:r>
-        <w:t xml:space="preserve">, </w:t>
-      </w:r>
-      <w:proofErr w:type="gramStart"/>
-      <w:r>
-        <w:t>a research</w:t>
-      </w:r>
-      <w:proofErr w:type="gramEnd"/>
-      <w:r>
-        <w:t xml:space="preserve"> </w:t>
-      </w:r>
-      <w:proofErr w:type="gramStart"/>
-      <w:r>
-        <w:t>has to</w:t>
-      </w:r>
-      <w:proofErr w:type="gramEnd"/>
-      <w:r>
-        <w:t xml:space="preserve"> be conducted, exploring possible solutions, including technologies, scope, database, hosting etc. which is the purpose of this document.</w:t>
+      <w:r>
+        <w:t>In order to meet all the project’s requirement, a research has to be conducted, exploring possible solutions, including technologies, scope, database, hosting etc. which is the purpose of this document.</w:t>
       </w:r>
     </w:p>
     <w:p>
@@ -992,15 +963,7 @@
         </w:rPr>
       </w:pPr>
       <w:r>
-        <w:t xml:space="preserve">This section gives an overview of the DOT framework application for this project, presenting the </w:t>
-      </w:r>
-      <w:proofErr w:type="gramStart"/>
-      <w:r>
-        <w:t>used domain</w:t>
-      </w:r>
-      <w:proofErr w:type="gramEnd"/>
-      <w:r>
-        <w:t>, methods and reason why this method/s are used per sub-research question.</w:t>
+        <w:t>This section gives an overview of the DOT framework application for this project, presenting the used domain, methods and reason why this method/s are used per sub-research question.</w:t>
       </w:r>
       <w:r>
         <w:t xml:space="preserve"> The following DOT frameworks patterns were applied: </w:t>
@@ -1067,31 +1030,6 @@
           <w:b/>
           <w:bCs/>
         </w:rPr>
-      </w:pPr>
-    </w:p>
-    <w:p>
-      <w:pPr>
-        <w:spacing w:after="160" w:line="278" w:lineRule="auto"/>
-        <w:ind w:left="225" w:firstLine="0"/>
-      </w:pPr>
-      <w:r>
-        <w:lastRenderedPageBreak/>
-        <w:br w:type="page"/>
-      </w:r>
-    </w:p>
-    <w:p>
-      <w:pPr>
-        <w:spacing w:after="0"/>
-      </w:pPr>
-    </w:p>
-    <w:p>
-      <w:pPr>
-        <w:spacing w:after="0"/>
-      </w:pPr>
-    </w:p>
-    <w:p>
-      <w:pPr>
-        <w:spacing w:after="0"/>
       </w:pPr>
     </w:p>
     <w:tbl>
@@ -1118,7 +1056,7 @@
         </w:trPr>
         <w:tc>
           <w:tcPr>
-            <w:tcW w:w="1328" w:type="dxa"/>
+            <w:tcW w:w="1351" w:type="dxa"/>
             <w:tcBorders>
               <w:top w:val="double" w:sz="4" w:space="0" w:color="000000"/>
               <w:left w:val="double" w:sz="4" w:space="0" w:color="000000"/>
@@ -1142,6 +1080,7 @@
                 <w:b/>
                 <w:bCs/>
               </w:rPr>
+              <w:lastRenderedPageBreak/>
               <w:t>Subquestion</w:t>
             </w:r>
             <w:proofErr w:type="spellEnd"/>
@@ -1149,7 +1088,7 @@
         </w:tc>
         <w:tc>
           <w:tcPr>
-            <w:tcW w:w="1653" w:type="dxa"/>
+            <w:tcW w:w="1650" w:type="dxa"/>
             <w:tcBorders>
               <w:top w:val="double" w:sz="4" w:space="0" w:color="000000"/>
               <w:left w:val="double" w:sz="4" w:space="0" w:color="000000"/>
@@ -1178,7 +1117,7 @@
         </w:tc>
         <w:tc>
           <w:tcPr>
-            <w:tcW w:w="3148" w:type="dxa"/>
+            <w:tcW w:w="3137" w:type="dxa"/>
             <w:tcBorders>
               <w:top w:val="double" w:sz="4" w:space="0" w:color="000000"/>
               <w:left w:val="double" w:sz="4" w:space="0" w:color="000000"/>
@@ -1207,7 +1146,7 @@
         </w:tc>
         <w:tc>
           <w:tcPr>
-            <w:tcW w:w="2899" w:type="dxa"/>
+            <w:tcW w:w="2890" w:type="dxa"/>
             <w:tcBorders>
               <w:top w:val="double" w:sz="4" w:space="0" w:color="000000"/>
               <w:left w:val="double" w:sz="4" w:space="0" w:color="000000"/>
@@ -1241,7 +1180,7 @@
         </w:trPr>
         <w:tc>
           <w:tcPr>
-            <w:tcW w:w="1328" w:type="dxa"/>
+            <w:tcW w:w="1351" w:type="dxa"/>
             <w:tcBorders>
               <w:top w:val="double" w:sz="4" w:space="0" w:color="000000"/>
               <w:left w:val="double" w:sz="4" w:space="0" w:color="000000"/>
@@ -1267,7 +1206,7 @@
         </w:tc>
         <w:tc>
           <w:tcPr>
-            <w:tcW w:w="1653" w:type="dxa"/>
+            <w:tcW w:w="1650" w:type="dxa"/>
             <w:tcBorders>
               <w:top w:val="double" w:sz="4" w:space="0" w:color="000000"/>
               <w:left w:val="double" w:sz="4" w:space="0" w:color="000000"/>
@@ -1302,7 +1241,7 @@
         </w:tc>
         <w:tc>
           <w:tcPr>
-            <w:tcW w:w="3148" w:type="dxa"/>
+            <w:tcW w:w="3137" w:type="dxa"/>
             <w:tcBorders>
               <w:top w:val="double" w:sz="4" w:space="0" w:color="000000"/>
               <w:left w:val="double" w:sz="4" w:space="0" w:color="000000"/>
@@ -1334,7 +1273,7 @@
         </w:tc>
         <w:tc>
           <w:tcPr>
-            <w:tcW w:w="2899" w:type="dxa"/>
+            <w:tcW w:w="2890" w:type="dxa"/>
             <w:tcBorders>
               <w:top w:val="double" w:sz="4" w:space="0" w:color="000000"/>
               <w:left w:val="double" w:sz="4" w:space="0" w:color="000000"/>
@@ -1371,7 +1310,7 @@
         </w:trPr>
         <w:tc>
           <w:tcPr>
-            <w:tcW w:w="1328" w:type="dxa"/>
+            <w:tcW w:w="1351" w:type="dxa"/>
             <w:tcBorders>
               <w:top w:val="double" w:sz="4" w:space="0" w:color="000000"/>
               <w:left w:val="double" w:sz="4" w:space="0" w:color="000000"/>
@@ -1397,7 +1336,7 @@
         </w:tc>
         <w:tc>
           <w:tcPr>
-            <w:tcW w:w="1653" w:type="dxa"/>
+            <w:tcW w:w="1650" w:type="dxa"/>
             <w:tcBorders>
               <w:top w:val="double" w:sz="4" w:space="0" w:color="000000"/>
               <w:left w:val="double" w:sz="4" w:space="0" w:color="000000"/>
@@ -1426,7 +1365,7 @@
         </w:tc>
         <w:tc>
           <w:tcPr>
-            <w:tcW w:w="3148" w:type="dxa"/>
+            <w:tcW w:w="3137" w:type="dxa"/>
             <w:tcBorders>
               <w:top w:val="double" w:sz="4" w:space="0" w:color="000000"/>
               <w:left w:val="double" w:sz="4" w:space="0" w:color="000000"/>
@@ -1467,7 +1406,7 @@
         </w:tc>
         <w:tc>
           <w:tcPr>
-            <w:tcW w:w="2899" w:type="dxa"/>
+            <w:tcW w:w="2890" w:type="dxa"/>
             <w:tcBorders>
               <w:top w:val="double" w:sz="4" w:space="0" w:color="000000"/>
               <w:left w:val="double" w:sz="4" w:space="0" w:color="000000"/>
@@ -1480,13 +1419,8 @@
               <w:spacing w:after="0" w:line="259" w:lineRule="auto"/>
               <w:ind w:left="4" w:firstLine="0"/>
             </w:pPr>
-            <w:proofErr w:type="gramStart"/>
             <w:r>
-              <w:t>Finding about</w:t>
-            </w:r>
-            <w:proofErr w:type="gramEnd"/>
-            <w:r>
-              <w:t xml:space="preserve"> g</w:t>
+              <w:t>Finding about g</w:t>
             </w:r>
             <w:r>
               <w:t>ood and bad practices</w:t>
@@ -1503,7 +1437,7 @@
         </w:trPr>
         <w:tc>
           <w:tcPr>
-            <w:tcW w:w="1328" w:type="dxa"/>
+            <w:tcW w:w="1351" w:type="dxa"/>
             <w:tcBorders>
               <w:top w:val="double" w:sz="4" w:space="0" w:color="000000"/>
               <w:left w:val="double" w:sz="4" w:space="0" w:color="000000"/>
@@ -1529,7 +1463,7 @@
         </w:tc>
         <w:tc>
           <w:tcPr>
-            <w:tcW w:w="1653" w:type="dxa"/>
+            <w:tcW w:w="1650" w:type="dxa"/>
             <w:tcBorders>
               <w:top w:val="double" w:sz="4" w:space="0" w:color="000000"/>
               <w:left w:val="double" w:sz="4" w:space="0" w:color="000000"/>
@@ -1555,7 +1489,7 @@
         </w:tc>
         <w:tc>
           <w:tcPr>
-            <w:tcW w:w="3148" w:type="dxa"/>
+            <w:tcW w:w="3137" w:type="dxa"/>
             <w:tcBorders>
               <w:top w:val="double" w:sz="4" w:space="0" w:color="000000"/>
               <w:left w:val="double" w:sz="4" w:space="0" w:color="000000"/>
@@ -1578,7 +1512,7 @@
         </w:tc>
         <w:tc>
           <w:tcPr>
-            <w:tcW w:w="2899" w:type="dxa"/>
+            <w:tcW w:w="2890" w:type="dxa"/>
             <w:tcBorders>
               <w:top w:val="double" w:sz="4" w:space="0" w:color="000000"/>
               <w:left w:val="double" w:sz="4" w:space="0" w:color="000000"/>
@@ -1593,15 +1527,7 @@
               <w:ind w:left="4" w:firstLine="0"/>
             </w:pPr>
             <w:r>
-              <w:t xml:space="preserve">Collecting </w:t>
-            </w:r>
-            <w:proofErr w:type="gramStart"/>
-            <w:r>
-              <w:t>feedbacks</w:t>
-            </w:r>
-            <w:proofErr w:type="gramEnd"/>
-            <w:r>
-              <w:t xml:space="preserve"> from users</w:t>
+              <w:t>Collecting feedbacks from users</w:t>
             </w:r>
             <w:r>
               <w:t>, demonstration of the feature.</w:t>
@@ -1615,7 +1541,7 @@
         </w:trPr>
         <w:tc>
           <w:tcPr>
-            <w:tcW w:w="1328" w:type="dxa"/>
+            <w:tcW w:w="1351" w:type="dxa"/>
             <w:tcBorders>
               <w:top w:val="double" w:sz="4" w:space="0" w:color="000000"/>
               <w:left w:val="double" w:sz="4" w:space="0" w:color="000000"/>
@@ -1635,7 +1561,7 @@
         </w:tc>
         <w:tc>
           <w:tcPr>
-            <w:tcW w:w="1653" w:type="dxa"/>
+            <w:tcW w:w="1650" w:type="dxa"/>
             <w:tcBorders>
               <w:top w:val="double" w:sz="4" w:space="0" w:color="000000"/>
               <w:left w:val="double" w:sz="4" w:space="0" w:color="000000"/>
@@ -1655,7 +1581,7 @@
         </w:tc>
         <w:tc>
           <w:tcPr>
-            <w:tcW w:w="3148" w:type="dxa"/>
+            <w:tcW w:w="3137" w:type="dxa"/>
             <w:tcBorders>
               <w:top w:val="double" w:sz="4" w:space="0" w:color="000000"/>
               <w:left w:val="double" w:sz="4" w:space="0" w:color="000000"/>
@@ -1678,7 +1604,7 @@
         </w:tc>
         <w:tc>
           <w:tcPr>
-            <w:tcW w:w="2899" w:type="dxa"/>
+            <w:tcW w:w="2890" w:type="dxa"/>
             <w:tcBorders>
               <w:top w:val="double" w:sz="4" w:space="0" w:color="000000"/>
               <w:left w:val="double" w:sz="4" w:space="0" w:color="000000"/>
@@ -1707,27 +1633,14 @@
       <w:r>
         <w:t xml:space="preserve">Table </w:t>
       </w:r>
-      <w:r>
-        <w:fldChar w:fldCharType="begin"/>
-      </w:r>
-      <w:r>
-        <w:instrText xml:space="preserve"> SEQ Table \* ARABIC </w:instrText>
-      </w:r>
-      <w:r>
-        <w:fldChar w:fldCharType="separate"/>
-      </w:r>
-      <w:r>
-        <w:rPr>
-          <w:noProof/>
-        </w:rPr>
-        <w:t>1</w:t>
-      </w:r>
-      <w:r>
-        <w:rPr>
-          <w:noProof/>
-        </w:rPr>
-        <w:fldChar w:fldCharType="end"/>
-      </w:r>
+      <w:fldSimple w:instr=" SEQ Table \* ARABIC ">
+        <w:r>
+          <w:rPr>
+            <w:noProof/>
+          </w:rPr>
+          <w:t>1</w:t>
+        </w:r>
+      </w:fldSimple>
       <w:r>
         <w:t>: DOT framework application</w:t>
       </w:r>
@@ -1741,23 +1654,7 @@
         <w:t xml:space="preserve"> </w:t>
       </w:r>
       <w:r>
-        <w:t xml:space="preserve">Using </w:t>
-      </w:r>
-      <w:proofErr w:type="gramStart"/>
-      <w:r>
-        <w:t>these combination</w:t>
-      </w:r>
-      <w:proofErr w:type="gramEnd"/>
-      <w:r>
-        <w:t xml:space="preserve"> of patterns would help me to conduct the necessary applied research for this project by promoting specific research methods suitable for each sub-</w:t>
-      </w:r>
-      <w:proofErr w:type="gramStart"/>
-      <w:r>
-        <w:t>questions</w:t>
-      </w:r>
-      <w:proofErr w:type="gramEnd"/>
-      <w:r>
-        <w:t xml:space="preserve">. </w:t>
+        <w:t xml:space="preserve">Using these combination of patterns would help me to conduct the necessary applied research for this project by promoting specific research methods suitable for each sub-questions. </w:t>
       </w:r>
     </w:p>
     <w:p>
@@ -1869,13 +1766,8 @@
         <w:t xml:space="preserve"> Moreover, the m</w:t>
       </w:r>
       <w:r>
-        <w:t xml:space="preserve">orphological </w:t>
-      </w:r>
-      <w:proofErr w:type="gramStart"/>
-      <w:r>
-        <w:t>char</w:t>
-      </w:r>
-      <w:proofErr w:type="gramEnd"/>
+        <w:t>orphological char</w:t>
+      </w:r>
       <w:r>
         <w:t xml:space="preserve"> shows that the most important </w:t>
       </w:r>
@@ -1883,13 +1775,8 @@
         <w:t>features</w:t>
       </w:r>
       <w:r>
-        <w:t xml:space="preserve"> </w:t>
-      </w:r>
-      <w:proofErr w:type="gramStart"/>
-      <w:r>
-        <w:t>are:</w:t>
-      </w:r>
-      <w:proofErr w:type="gramEnd"/>
+        <w:t xml:space="preserve"> are:</w:t>
+      </w:r>
       <w:r>
         <w:t xml:space="preserve"> </w:t>
       </w:r>
@@ -2402,15 +2289,7 @@
         <w:t xml:space="preserve"> </w:t>
       </w:r>
       <w:r>
-        <w:t xml:space="preserve">the project’s scope, would fit, keeping the project maintainable, while leaving a room for further extensibility, layering on top of it and </w:t>
-      </w:r>
-      <w:proofErr w:type="gramStart"/>
-      <w:r>
-        <w:t>possibility of hosting</w:t>
-      </w:r>
-      <w:proofErr w:type="gramEnd"/>
-      <w:r>
-        <w:t xml:space="preserve"> it and creating CI/CD pipelines.</w:t>
+        <w:t>the project’s scope, would fit, keeping the project maintainable, while leaving a room for further extensibility, layering on top of it and possibility of hosting it and creating CI/CD pipelines.</w:t>
       </w:r>
     </w:p>
     <w:p>
@@ -2474,24 +2353,14 @@
                             <w:r>
                               <w:t xml:space="preserve">Figure </w:t>
                             </w:r>
-                            <w:r>
-                              <w:fldChar w:fldCharType="begin"/>
-                            </w:r>
-                            <w:r>
-                              <w:instrText xml:space="preserve"> SEQ Figure \* ARABIC </w:instrText>
-                            </w:r>
-                            <w:r>
-                              <w:fldChar w:fldCharType="separate"/>
-                            </w:r>
-                            <w:r>
-                              <w:rPr>
-                                <w:noProof/>
-                              </w:rPr>
-                              <w:t>1</w:t>
-                            </w:r>
-                            <w:r>
-                              <w:fldChar w:fldCharType="end"/>
-                            </w:r>
+                            <w:fldSimple w:instr=" SEQ Figure \* ARABIC ">
+                              <w:r>
+                                <w:rPr>
+                                  <w:noProof/>
+                                </w:rPr>
+                                <w:t>1</w:t>
+                              </w:r>
+                            </w:fldSimple>
                             <w:r>
                               <w:t>: Research comparison table</w:t>
                             </w:r>
@@ -2881,23 +2750,7 @@
           <w:i/>
           <w:iCs/>
         </w:rPr>
-        <w:t xml:space="preserve">What </w:t>
-      </w:r>
-      <w:proofErr w:type="gramStart"/>
-      <w:r>
-        <w:rPr>
-          <w:i/>
-          <w:iCs/>
-        </w:rPr>
-        <w:t>is</w:t>
-      </w:r>
-      <w:proofErr w:type="gramEnd"/>
-      <w:r>
-        <w:rPr>
-          <w:i/>
-          <w:iCs/>
-        </w:rPr>
-        <w:t xml:space="preserve"> Customer Demographics and Target Market of CAR Group Company?</w:t>
+        <w:t>What is Customer Demographics and Target Market of CAR Group Company?</w:t>
       </w:r>
       <w:r>
         <w:t xml:space="preserve"> Porter’s Five Forces. </w:t>
@@ -3126,16 +2979,11 @@
         <w:t>Asad Ali</w:t>
       </w:r>
       <w:r>
-        <w:t xml:space="preserve">. </w:t>
-      </w:r>
-      <w:proofErr w:type="gramStart"/>
-      <w:r>
-        <w:t>https://asadali.dev/blog/designing-multi-tenant-saas-azure-aspnetcore-postgresql-sqlserver/#2-1-database-per-tenant</w:t>
+        <w:t>. https://asadali.dev/blog/designing-multi-tenant-saas-azure-aspnetcore-postgresql-sqlserver/#2-1-database-per-tenant</w:t>
       </w:r>
       <w:r>
         <w:t>, accessed on 15.04.2026</w:t>
       </w:r>
-      <w:proofErr w:type="gramEnd"/>
     </w:p>
     <w:p>
       <w:pPr>
@@ -3255,26 +3103,17 @@
           <w:i/>
           <w:iCs/>
         </w:rPr>
-        <w:t xml:space="preserve">Where and how can I host small </w:t>
-      </w:r>
-      <w:proofErr w:type="gramStart"/>
+        <w:t>Where and how can I host small ASP .</w:t>
+      </w:r>
+      <w:proofErr w:type="spellStart"/>
       <w:r>
         <w:rPr>
           <w:i/>
           <w:iCs/>
         </w:rPr>
-        <w:t>ASP .</w:t>
-      </w:r>
-      <w:proofErr w:type="spellStart"/>
-      <w:r>
-        <w:rPr>
-          <w:i/>
-          <w:iCs/>
-        </w:rPr>
         <w:t>NETCore</w:t>
       </w:r>
       <w:proofErr w:type="spellEnd"/>
-      <w:proofErr w:type="gramEnd"/>
       <w:r>
         <w:rPr>
           <w:i/>
@@ -6874,6 +6713,7 @@
   <w:style w:type="character" w:default="1" w:styleId="DefaultParagraphFont">
     <w:name w:val="Default Paragraph Font"/>
     <w:uiPriority w:val="1"/>
+    <w:semiHidden/>
     <w:unhideWhenUsed/>
   </w:style>
   <w:style w:type="table" w:default="1" w:styleId="TableNormal">

</xml_diff>